<commit_message>
handoff revision: add skill-state callout to clarify v0.7.1 bugs are logged but not fixed
</commit_message>
<xml_diff>
--- a/docs/handoffs/GRM_Handoff_2026-04-15_Flagship-2-A1-Payless-Septic-Shipped.docx
+++ b/docs/handoffs/GRM_Handoff_2026-04-15_Flagship-2-A1-Payless-Septic-Shipped.docx
@@ -90,6 +90,43 @@
           <w:rtl w:val="0"/>
         </w:rPr>
         <w:t xml:space="preserve">Working pattern this session: Claude led technical decisions and drafted paste-ready prompts for Claude Code; Ron brought the media eye, called creative direction, and pushed back where the skill's defaults were wrong. The relay was tight — every prompt was paste-ready, every report came back actionable, and no decision required more than one round of clarification. First real partnership-mode session and the structure worked.</w:t>
+      </w:r>
+    </w:p>
+    <w:p>
+      <w:pPr>
+        <w:pStyle w:val="Heading2"/>
+        <w:rPr/>
+      </w:pPr>
+      <w:r>
+        <w:rPr>
+          <w:rtl w:val="0"/>
+        </w:rPr>
+        <w:t xml:space="preserve">⚠️ Skill state — read this before assuming anything is fixed</w:t>
+      </w:r>
+    </w:p>
+    <w:p>
+      <w:pPr>
+        <w:rPr/>
+      </w:pPr>
+      <w:r>
+        <w:rPr>
+          <w:b w:val="1"/>
+          <w:bCs w:val="1"/>
+          <w:color w:val="8b0000"/>
+          <w:rtl w:val="0"/>
+        </w:rPr>
+        <w:t xml:space="preserve">v0.7.1 is UNCHANGED. The 5 bugs documented in this handoff are LOGGED in LESSONS.md but NOT FIXED in the skill. They will reproduce on every future /prospect-site build until the post-launch skill upgrade work happens. This is a deliberate technical-debt acceptance per Monday's standing rule (no skill engineering until sales kickoff is behind us), not an oversight.</w:t>
+        <w:br w:type="textWrapping"/>
+        <w:br w:type="textWrapping"/>
+        <w:t xml:space="preserve">Mitigation in place: the pre-deploy verification checklist in the companion brain update doc (GRM_Brain_Update_2026-04-15_Session-Close.docx) catches all 5 bugs manually before any build ships. Run that checklist on every v0.7.1 build between now and post-launch skill work. Skipping it means shipping broken — most critically, shipping a contact form that 404s on every successful submission (bug #5).</w:t>
+        <w:br w:type="textWrapping"/>
+        <w:br w:type="textWrapping"/>
+        <w:t xml:space="preserve">When you read "5 entries appended to LESSONS.md" later in this doc, read it as "5 bugs logged for later fix," NOT as "5 bugs handled." The distinction matters.</w:t>
+      </w:r>
+      <w:r>
+        <w:rPr>
+          <w:rtl w:val="0"/>
+        </w:rPr>
       </w:r>
     </w:p>
     <w:p>

</xml_diff>